<commit_message>
add "first_read_through" directive to readme to enhance strategic planning prior to putting pen to paper
</commit_message>
<xml_diff>
--- a/Caleb Miller Cover Letter.docx
+++ b/Caleb Miller Cover Letter.docx
@@ -3,284 +3,83 @@
 <w:document xmlns:wpc="http://schemas.microsoft.com/office/word/2010/wordprocessingCanvas" xmlns:cx="http://schemas.microsoft.com/office/drawing/2014/chartex" xmlns:cx1="http://schemas.microsoft.com/office/drawing/2015/9/8/chartex" xmlns:cx2="http://schemas.microsoft.com/office/drawing/2015/10/21/chartex" xmlns:cx3="http://schemas.microsoft.com/office/drawing/2016/5/9/chartex" xmlns:cx4="http://schemas.microsoft.com/office/drawing/2016/5/10/chartex" xmlns:cx5="http://schemas.microsoft.com/office/drawing/2016/5/11/chartex" xmlns:cx6="http://schemas.microsoft.com/office/drawing/2016/5/12/chartex" xmlns:cx7="http://schemas.microsoft.com/office/drawing/2016/5/13/chartex" xmlns:cx8="http://schemas.microsoft.com/office/drawing/2016/5/14/chartex" xmlns:mc="http://schemas.openxmlformats.org/markup-compatibility/2006" xmlns:aink="http://schemas.microsoft.com/office/drawing/2016/ink" xmlns:am3d="http://schemas.microsoft.com/office/drawing/2017/model3d" xmlns:o="urn:schemas-microsoft-com:office:office" xmlns:oel="http://schemas.microsoft.com/office/2019/extlst" xmlns:r="http://schemas.openxmlformats.org/officeDocument/2006/relationships" xmlns:m="http://schemas.openxmlformats.org/officeDocument/2006/math" xmlns:v="urn:schemas-microsoft-com:vml" xmlns:wp14="http://schemas.microsoft.com/office/word/2010/wordprocessingDrawing" xmlns:wp="http://schemas.openxmlformats.org/drawingml/2006/wordprocessingDrawing" xmlns:w10="urn:schemas-microsoft-com:office:word" xmlns:w="http://schemas.openxmlformats.org/wordprocessingml/2006/main" xmlns:w14="http://schemas.microsoft.com/office/word/2010/wordml" xmlns:w15="http://schemas.microsoft.com/office/word/2012/wordml" xmlns:w16cex="http://schemas.microsoft.com/office/word/2018/wordml/cex" xmlns:w16cid="http://schemas.microsoft.com/office/word/2016/wordml/cid" xmlns:w16="http://schemas.microsoft.com/office/word/2018/wordml" xmlns:w16du="http://schemas.microsoft.com/office/word/2023/wordml/word16du" xmlns:w16sdtdh="http://schemas.microsoft.com/office/word/2020/wordml/sdtdatahash" xmlns:w16sdtfl="http://schemas.microsoft.com/office/word/2024/wordml/sdtformatlock" xmlns:w16se="http://schemas.microsoft.com/office/word/2015/wordml/symex" xmlns:wpg="http://schemas.microsoft.com/office/word/2010/wordprocessingGroup" xmlns:wpi="http://schemas.microsoft.com/office/word/2010/wordprocessingInk" xmlns:wne="http://schemas.microsoft.com/office/word/2006/wordml" xmlns:wps="http://schemas.microsoft.com/office/word/2010/wordprocessingShape" mc:Ignorable="w14 w15 w16se w16cid w16 w16cex w16sdtdh w16sdtfl w16du wp14">
   <w:body>
     <w:p>
-      <w:pPr>
-        <w:rPr>
-          <w:rFonts w:eastAsia="Times New Roman" w:cs="Carlito"/>
-          <w:kern w:val="0"/>
-          <w:sz w:val="24"/>
-          <w:szCs w:val="24"/>
-          <w14:ligatures w14:val="none"/>
-        </w:rPr>
-      </w:pPr>
       <w:r>
-        <w:rPr>
-          <w:rFonts w:eastAsia="Times New Roman" w:cs="Carlito"/>
-          <w:kern w:val="0"/>
-          <w:sz w:val="24"/>
-          <w:szCs w:val="24"/>
-          <w14:ligatures w14:val="none"/>
-        </w:rPr>
         <w:t xml:space="preserve">Dear </w:t>
       </w:r>
       <w:proofErr w:type="spellStart"/>
       <w:r>
-        <w:rPr>
-          <w:rFonts w:eastAsia="Times New Roman" w:cs="Carlito"/>
-          <w:kern w:val="0"/>
-          <w:sz w:val="24"/>
-          <w:szCs w:val="24"/>
-          <w14:ligatures w14:val="none"/>
-        </w:rPr>
-        <w:t>GoGuardian</w:t>
+        <w:t>SimplePractice</w:t>
       </w:r>
       <w:proofErr w:type="spellEnd"/>
       <w:r>
-        <w:rPr>
-          <w:rFonts w:eastAsia="Times New Roman" w:cs="Carlito"/>
-          <w:kern w:val="0"/>
-          <w:sz w:val="24"/>
-          <w:szCs w:val="24"/>
-          <w14:ligatures w14:val="none"/>
-        </w:rPr>
         <w:t xml:space="preserve"> Hiring Team,</w:t>
       </w:r>
     </w:p>
     <w:p>
-      <w:pPr>
-        <w:rPr>
-          <w:rFonts w:eastAsia="Times New Roman" w:cs="Carlito"/>
-          <w:kern w:val="0"/>
-          <w:sz w:val="24"/>
-          <w:szCs w:val="24"/>
-          <w14:ligatures w14:val="none"/>
-        </w:rPr>
-      </w:pPr>
       <w:r>
-        <w:rPr>
-          <w:rFonts w:eastAsia="Times New Roman" w:cs="Carlito"/>
-          <w:kern w:val="0"/>
-          <w:sz w:val="24"/>
-          <w:szCs w:val="24"/>
-          <w14:ligatures w14:val="none"/>
-        </w:rPr>
-        <w:t xml:space="preserve">I’m excited to apply for the Solutions Engineer </w:t>
+        <w:t xml:space="preserve">I'm excited to apply for the IT Support Engineer role. </w:t>
       </w:r>
       <w:r>
-        <w:rPr>
-          <w:rFonts w:eastAsia="Times New Roman" w:cs="Carlito"/>
-          <w:kern w:val="0"/>
-          <w:sz w:val="24"/>
-          <w:szCs w:val="24"/>
-          <w14:ligatures w14:val="none"/>
-        </w:rPr>
-        <w:t>position within your company</w:t>
+        <w:t xml:space="preserve">My 9 years of comprehensive IT support experience, which includes traditional helpdesk support, internal project implementation, </w:t>
       </w:r>
+      <w:proofErr w:type="spellStart"/>
       <w:r>
-        <w:rPr>
-          <w:rFonts w:eastAsia="Times New Roman" w:cs="Carlito"/>
-          <w:kern w:val="0"/>
-          <w:sz w:val="24"/>
-          <w:szCs w:val="24"/>
-          <w14:ligatures w14:val="none"/>
-        </w:rPr>
-        <w:t xml:space="preserve">. My experience across product implementation, customer-facing technical support, and solutions design </w:t>
+        <w:t>intrastructure</w:t>
       </w:r>
+      <w:proofErr w:type="spellEnd"/>
       <w:r>
-        <w:rPr>
-          <w:rFonts w:eastAsia="Times New Roman" w:cs="Carlito"/>
-          <w:kern w:val="0"/>
-          <w:sz w:val="24"/>
-          <w:szCs w:val="24"/>
-          <w14:ligatures w14:val="none"/>
-        </w:rPr>
-        <w:t>makes me a strong fit for the role</w:t>
-      </w:r>
-      <w:r>
-        <w:rPr>
-          <w:rFonts w:eastAsia="Times New Roman" w:cs="Carlito"/>
-          <w:kern w:val="0"/>
-          <w:sz w:val="24"/>
-          <w:szCs w:val="24"/>
-          <w14:ligatures w14:val="none"/>
-        </w:rPr>
-        <w:t>. I’m comfortable learning a customer’s environment, identifying the right technical path forward, explaining options clearly, and turning messy requirements into working solutions.</w:t>
+        <w:t xml:space="preserve"> support, and scripting, makes me a standout fit for the role.</w:t>
       </w:r>
     </w:p>
     <w:p>
-      <w:pPr>
-        <w:rPr>
-          <w:rFonts w:eastAsia="Times New Roman" w:cs="Carlito"/>
-          <w:kern w:val="0"/>
-          <w:sz w:val="24"/>
-          <w:szCs w:val="24"/>
-          <w14:ligatures w14:val="none"/>
-        </w:rPr>
-      </w:pPr>
       <w:r>
-        <w:rPr>
-          <w:rFonts w:eastAsia="Times New Roman" w:cs="Carlito"/>
-          <w:kern w:val="0"/>
-          <w:sz w:val="24"/>
-          <w:szCs w:val="24"/>
-          <w14:ligatures w14:val="none"/>
-        </w:rPr>
-        <w:t>For the past year and a half, I’ve worked independently and with a digital marketing agency to design and support code-based and SaaS solutions for client needs. I quickly developed deep expertise in WordPress and WooCommerce, using PHP, platform configuration, and troubleshooting experience to solve complex client issues. I also built Subscription Everything, a WooCommerce plugin designed around configurable subscription update workflows, logging, email notifications, and regression-tested business logic. Building that product with modern generative AI tools gave me valuable experience translating complex use cases into practical, validated software workflows.</w:t>
+        <w:t>My background is a little broader than a traditional internal IT support path, but that is also why I believe I would be a stronger-than-normal fit for this role. I bring 9 years of experience across enterprise SaaS support, product implementation, technical troubleshooting, documentation, training, and hands-on systems work. At Apica, I supported complex customer environments involving Windows and Linux systems, Active Directory, user provisioning, secure access, SaaS configuration, logs, SQL, APIs, telemetry, and production issue resolution. I also spent years writing knowledge base content, helping users understand technical workflows, and translating messy support issues into clear next steps.</w:t>
       </w:r>
     </w:p>
     <w:p>
-      <w:pPr>
-        <w:rPr>
-          <w:rFonts w:eastAsia="Times New Roman" w:cs="Carlito"/>
-          <w:kern w:val="0"/>
-          <w:sz w:val="24"/>
-          <w:szCs w:val="24"/>
-          <w14:ligatures w14:val="none"/>
-        </w:rPr>
-      </w:pPr>
       <w:r>
-        <w:rPr>
-          <w:rFonts w:eastAsia="Times New Roman" w:cs="Carlito"/>
-          <w:kern w:val="0"/>
-          <w:sz w:val="24"/>
-          <w:szCs w:val="24"/>
-          <w14:ligatures w14:val="none"/>
-        </w:rPr>
-        <w:t>Before that, I spent 6 years in enterprise SaaS support at Apica, progressing from Technical Support Engineer to Senior Technical Support Engineer and later Professional Services Engineer. That experience gave me a strong foundation in customer-facing technical ownership: diagnosing complex issues, explaining product behavior clearly, partnering with Engineering, writing documentation, leading customer training, and helping teams get real value from a technical platform. Much of that work already overlapped with Solutions Engineering: translating customer needs and technical symptoms into configurations, implementation guidance, product feedback, or workable technical paths forward.</w:t>
+        <w:t xml:space="preserve">What stands out to me about </w:t>
+      </w:r>
+      <w:proofErr w:type="spellStart"/>
+      <w:r>
+        <w:t>SimplePractice</w:t>
+      </w:r>
+      <w:proofErr w:type="spellEnd"/>
+      <w:r>
+        <w:t xml:space="preserve"> is that your product directly reduces the administrative burden on clinicians, giving health and wellness providers more time and capacity to focus on their clients. That mission matters, and it also fits the kind of technical work I enjoy most: making systems easier, more reliable, and more understandable for the people who depend on them every day.</w:t>
       </w:r>
     </w:p>
     <w:p>
-      <w:pPr>
-        <w:rPr>
-          <w:rFonts w:eastAsia="Times New Roman" w:cs="Carlito"/>
-          <w:kern w:val="0"/>
-          <w:sz w:val="24"/>
-          <w:szCs w:val="24"/>
-          <w14:ligatures w14:val="none"/>
-        </w:rPr>
-      </w:pPr>
       <w:r>
-        <w:rPr>
-          <w:rFonts w:eastAsia="Times New Roman" w:cs="Carlito"/>
-          <w:kern w:val="0"/>
-          <w:sz w:val="24"/>
-          <w:szCs w:val="24"/>
-          <w14:ligatures w14:val="none"/>
-        </w:rPr>
-        <w:t xml:space="preserve">I’m interested in </w:t>
+        <w:t xml:space="preserve">What I would bring </w:t>
       </w:r>
       <w:proofErr w:type="spellStart"/>
       <w:r>
-        <w:rPr>
-          <w:rFonts w:eastAsia="Times New Roman" w:cs="Carlito"/>
-          <w:kern w:val="0"/>
-          <w:sz w:val="24"/>
-          <w:szCs w:val="24"/>
-          <w14:ligatures w14:val="none"/>
-        </w:rPr>
-        <w:t>GoGuardian</w:t>
+        <w:t>SimplePractice</w:t>
       </w:r>
       <w:proofErr w:type="spellEnd"/>
       <w:r>
-        <w:rPr>
-          <w:rFonts w:eastAsia="Times New Roman" w:cs="Carlito"/>
-          <w:kern w:val="0"/>
-          <w:sz w:val="24"/>
-          <w:szCs w:val="24"/>
-          <w14:ligatures w14:val="none"/>
-        </w:rPr>
-        <w:t xml:space="preserve"> because this role brings together the parts of technical </w:t>
-      </w:r>
-      <w:proofErr w:type="gramStart"/>
-      <w:r>
-        <w:rPr>
-          <w:rFonts w:eastAsia="Times New Roman" w:cs="Carlito"/>
-          <w:kern w:val="0"/>
-          <w:sz w:val="24"/>
-          <w:szCs w:val="24"/>
-          <w14:ligatures w14:val="none"/>
-        </w:rPr>
-        <w:t>work</w:t>
-      </w:r>
-      <w:proofErr w:type="gramEnd"/>
-      <w:r>
-        <w:rPr>
-          <w:rFonts w:eastAsia="Times New Roman" w:cs="Carlito"/>
-          <w:kern w:val="0"/>
-          <w:sz w:val="24"/>
-          <w:szCs w:val="24"/>
-          <w14:ligatures w14:val="none"/>
-        </w:rPr>
-        <w:t xml:space="preserve"> I’m best at: customer discovery, product expertise, implementation planning, documentation, and trusted technical guidance. </w:t>
-      </w:r>
-      <w:r>
-        <w:rPr>
-          <w:rFonts w:eastAsia="Times New Roman" w:cs="Carlito"/>
-          <w:kern w:val="0"/>
-          <w:sz w:val="24"/>
-          <w:szCs w:val="24"/>
-          <w14:ligatures w14:val="none"/>
-        </w:rPr>
-        <w:t xml:space="preserve"> </w:t>
-      </w:r>
-      <w:r>
-        <w:rPr>
-          <w:rFonts w:eastAsia="Times New Roman" w:cs="Carlito"/>
-          <w:kern w:val="0"/>
-          <w:sz w:val="24"/>
-          <w:szCs w:val="24"/>
-          <w14:ligatures w14:val="none"/>
-        </w:rPr>
-        <w:t>I’d bring</w:t>
-      </w:r>
-      <w:r>
-        <w:rPr>
-          <w:rFonts w:eastAsia="Times New Roman" w:cs="Carlito"/>
-          <w:kern w:val="0"/>
-          <w:sz w:val="24"/>
-          <w:szCs w:val="24"/>
-          <w14:ligatures w14:val="none"/>
-        </w:rPr>
-        <w:t xml:space="preserve"> the company </w:t>
-      </w:r>
-      <w:r>
-        <w:rPr>
-          <w:rFonts w:eastAsia="Times New Roman" w:cs="Carlito"/>
-          <w:kern w:val="0"/>
-          <w:sz w:val="24"/>
-          <w:szCs w:val="24"/>
-          <w14:ligatures w14:val="none"/>
-        </w:rPr>
-        <w:t>a strong SaaS support foundation, real implementation and consulting experience, practical solution-building ability, and a genuine interest in helping customers understand, deploy, and trust the product.</w:t>
+        <w:t xml:space="preserve"> is someone who can handle support requests with patience and clarity, but who can also see patterns, document repeatable fixes, build practical improvements, and reduce recurring friction for employees. I am comfortable learning new SaaS tools quickly, communicating with both technical and non-technical users, and taking ownership of problems until they are actually resolved.</w:t>
       </w:r>
     </w:p>
     <w:p>
-      <w:pPr>
-        <w:rPr>
-          <w:rFonts w:eastAsia="Times New Roman" w:cs="Carlito"/>
-          <w:kern w:val="0"/>
-          <w:sz w:val="24"/>
-          <w:szCs w:val="24"/>
-          <w14:ligatures w14:val="none"/>
-        </w:rPr>
-      </w:pPr>
       <w:r>
-        <w:rPr>
-          <w:rFonts w:eastAsia="Times New Roman" w:cs="Carlito"/>
-          <w:kern w:val="0"/>
-          <w:sz w:val="24"/>
-          <w:szCs w:val="24"/>
-          <w14:ligatures w14:val="none"/>
-        </w:rPr>
+        <w:t xml:space="preserve">I would welcome the opportunity to bring that mix of support discipline, automation mindset, documentation strength, and user empathy to </w:t>
+      </w:r>
+      <w:proofErr w:type="spellStart"/>
+      <w:r>
+        <w:t>SimplePractice</w:t>
+      </w:r>
+      <w:proofErr w:type="spellEnd"/>
+      <w:r>
+        <w:t>.</w:t>
+      </w:r>
+    </w:p>
+    <w:p>
+      <w:r>
         <w:t>Sincerely,</w:t>
       </w:r>
       <w:r>
-        <w:rPr>
-          <w:rFonts w:eastAsia="Times New Roman" w:cs="Carlito"/>
-          <w:kern w:val="0"/>
-          <w:sz w:val="24"/>
-          <w:szCs w:val="24"/>
-          <w14:ligatures w14:val="none"/>
-        </w:rPr>
         <w:br/>
         <w:t>Caleb Miller</w:t>
       </w:r>

</xml_diff>

<commit_message>
add general chatbot directives and clarify hard rules for deliverables. Add a directive to avoid excessive use of commas - I'll ahve to revisit that one as needed
</commit_message>
<xml_diff>
--- a/Caleb Miller Cover Letter.docx
+++ b/Caleb Miller Cover Letter.docx
@@ -3,88 +3,202 @@
 <w:document xmlns:wpc="http://schemas.microsoft.com/office/word/2010/wordprocessingCanvas" xmlns:cx="http://schemas.microsoft.com/office/drawing/2014/chartex" xmlns:cx1="http://schemas.microsoft.com/office/drawing/2015/9/8/chartex" xmlns:cx2="http://schemas.microsoft.com/office/drawing/2015/10/21/chartex" xmlns:cx3="http://schemas.microsoft.com/office/drawing/2016/5/9/chartex" xmlns:cx4="http://schemas.microsoft.com/office/drawing/2016/5/10/chartex" xmlns:cx5="http://schemas.microsoft.com/office/drawing/2016/5/11/chartex" xmlns:cx6="http://schemas.microsoft.com/office/drawing/2016/5/12/chartex" xmlns:cx7="http://schemas.microsoft.com/office/drawing/2016/5/13/chartex" xmlns:cx8="http://schemas.microsoft.com/office/drawing/2016/5/14/chartex" xmlns:mc="http://schemas.openxmlformats.org/markup-compatibility/2006" xmlns:aink="http://schemas.microsoft.com/office/drawing/2016/ink" xmlns:am3d="http://schemas.microsoft.com/office/drawing/2017/model3d" xmlns:o="urn:schemas-microsoft-com:office:office" xmlns:oel="http://schemas.microsoft.com/office/2019/extlst" xmlns:r="http://schemas.openxmlformats.org/officeDocument/2006/relationships" xmlns:m="http://schemas.openxmlformats.org/officeDocument/2006/math" xmlns:v="urn:schemas-microsoft-com:vml" xmlns:wp14="http://schemas.microsoft.com/office/word/2010/wordprocessingDrawing" xmlns:wp="http://schemas.openxmlformats.org/drawingml/2006/wordprocessingDrawing" xmlns:w10="urn:schemas-microsoft-com:office:word" xmlns:w="http://schemas.openxmlformats.org/wordprocessingml/2006/main" xmlns:w14="http://schemas.microsoft.com/office/word/2010/wordml" xmlns:w15="http://schemas.microsoft.com/office/word/2012/wordml" xmlns:w16cex="http://schemas.microsoft.com/office/word/2018/wordml/cex" xmlns:w16cid="http://schemas.microsoft.com/office/word/2016/wordml/cid" xmlns:w16="http://schemas.microsoft.com/office/word/2018/wordml" xmlns:w16du="http://schemas.microsoft.com/office/word/2023/wordml/word16du" xmlns:w16sdtdh="http://schemas.microsoft.com/office/word/2020/wordml/sdtdatahash" xmlns:w16sdtfl="http://schemas.microsoft.com/office/word/2024/wordml/sdtformatlock" xmlns:w16se="http://schemas.microsoft.com/office/word/2015/wordml/symex" xmlns:wpg="http://schemas.microsoft.com/office/word/2010/wordprocessingGroup" xmlns:wpi="http://schemas.microsoft.com/office/word/2010/wordprocessingInk" xmlns:wne="http://schemas.microsoft.com/office/word/2006/wordml" xmlns:wps="http://schemas.microsoft.com/office/word/2010/wordprocessingShape" mc:Ignorable="w14 w15 w16se w16cid w16 w16cex w16sdtdh w16sdtfl w16du wp14">
   <w:body>
     <w:p>
+      <w:pPr>
+        <w:pStyle w:val="NormalWeb"/>
+        <w:rPr>
+          <w:rFonts w:ascii="Calibri" w:hAnsi="Calibri" w:cs="Calibri"/>
+        </w:rPr>
+      </w:pPr>
       <w:r>
-        <w:t xml:space="preserve">Dear </w:t>
+        <w:rPr>
+          <w:rFonts w:ascii="Calibri" w:hAnsi="Calibri" w:cs="Calibri"/>
+        </w:rPr>
+        <w:t>Caleb Miller</w:t>
       </w:r>
-      <w:proofErr w:type="spellStart"/>
       <w:r>
-        <w:t>SimplePractice</w:t>
+        <w:rPr>
+          <w:rFonts w:ascii="Calibri" w:hAnsi="Calibri" w:cs="Calibri"/>
+        </w:rPr>
+        <w:br/>
+        <w:t>Farmington, NH</w:t>
       </w:r>
-      <w:proofErr w:type="spellEnd"/>
       <w:r>
-        <w:t xml:space="preserve"> Hiring Team,</w:t>
+        <w:rPr>
+          <w:rFonts w:ascii="Calibri" w:hAnsi="Calibri" w:cs="Calibri"/>
+        </w:rPr>
+        <w:br/>
+      </w:r>
+      <w:hyperlink r:id="rId5" w:history="1">
+        <w:r>
+          <w:rPr>
+            <w:rStyle w:val="Hyperlink"/>
+            <w:rFonts w:ascii="Calibri" w:hAnsi="Calibri" w:cs="Calibri"/>
+          </w:rPr>
+          <w:t>caleb.miller734@outlook.com</w:t>
+        </w:r>
+      </w:hyperlink>
+      <w:r>
+        <w:rPr>
+          <w:rFonts w:ascii="Calibri" w:hAnsi="Calibri" w:cs="Calibri"/>
+        </w:rPr>
+        <w:br/>
+        <w:t>(603) 325-3197</w:t>
       </w:r>
     </w:p>
     <w:p>
+      <w:pPr>
+        <w:pStyle w:val="NormalWeb"/>
+        <w:rPr>
+          <w:rFonts w:ascii="Calibri" w:hAnsi="Calibri" w:cs="Calibri"/>
+        </w:rPr>
+      </w:pPr>
       <w:r>
-        <w:t xml:space="preserve">I'm excited to apply for the IT Support Engineer role. </w:t>
-      </w:r>
-      <w:r>
-        <w:t xml:space="preserve">My 9 years of comprehensive IT support experience, which includes traditional helpdesk support, internal project implementation, </w:t>
-      </w:r>
-      <w:proofErr w:type="spellStart"/>
-      <w:r>
-        <w:t>intrastructure</w:t>
-      </w:r>
-      <w:proofErr w:type="spellEnd"/>
-      <w:r>
-        <w:t xml:space="preserve"> support, and scripting, makes me a standout fit for the role.</w:t>
+        <w:rPr>
+          <w:rFonts w:ascii="Calibri" w:hAnsi="Calibri" w:cs="Calibri"/>
+        </w:rPr>
+        <w:t>Dear Thyme Care Hiring Team,</w:t>
       </w:r>
     </w:p>
     <w:p>
+      <w:pPr>
+        <w:pStyle w:val="NormalWeb"/>
+        <w:rPr>
+          <w:rFonts w:ascii="Calibri" w:hAnsi="Calibri" w:cs="Calibri"/>
+        </w:rPr>
+      </w:pPr>
       <w:r>
-        <w:t>My background is a little broader than a traditional internal IT support path, but that is also why I believe I would be a stronger-than-normal fit for this role. I bring 9 years of experience across enterprise SaaS support, product implementation, technical troubleshooting, documentation, training, and hands-on systems work. At Apica, I supported complex customer environments involving Windows and Linux systems, Active Directory, user provisioning, secure access, SaaS configuration, logs, SQL, APIs, telemetry, and production issue resolution. I also spent years writing knowledge base content, helping users understand technical workflows, and translating messy support issues into clear next steps.</w:t>
+        <w:rPr>
+          <w:rFonts w:ascii="Calibri" w:hAnsi="Calibri" w:cs="Calibri"/>
+        </w:rPr>
+        <w:t>I am excited to apply for the Product Implementation role at Thyme Care. The role’s focus on configuring tools, building structured processes, testing edge cases, investigating unexpected behavior, and helping care teams work more effectively strongly aligns with the kind of work I have done across SaaS, Professional Services, and production web application environments.</w:t>
       </w:r>
     </w:p>
     <w:p>
+      <w:pPr>
+        <w:pStyle w:val="NormalWeb"/>
+        <w:rPr>
+          <w:rFonts w:ascii="Calibri" w:hAnsi="Calibri" w:cs="Calibri"/>
+        </w:rPr>
+      </w:pPr>
       <w:r>
-        <w:t xml:space="preserve">What stands out to me about </w:t>
-      </w:r>
-      <w:proofErr w:type="spellStart"/>
-      <w:r>
-        <w:t>SimplePractice</w:t>
-      </w:r>
-      <w:proofErr w:type="spellEnd"/>
-      <w:r>
-        <w:t xml:space="preserve"> is that your product directly reduces the administrative burden on clinicians, giving health and wellness providers more time and capacity to focus on their clients. That mission matters, and it also fits the kind of technical work I enjoy most: making systems easier, more reliable, and more understandable for the people who depend on them every day.</w:t>
+        <w:rPr>
+          <w:rFonts w:ascii="Calibri" w:hAnsi="Calibri" w:cs="Calibri"/>
+        </w:rPr>
+        <w:t>At Apica, I spent six years supporting and implementing enterprise SaaS monitoring software, progressing from Technical Support Engineer to Senior Technical Support Engineer and then Professional Services Engineer. I owned complex customer issues end-to-end, investigated bugs and unexpected behavior using logs, APIs, SQL, telemetry, configuration details, and customer workflow context, and translated technical findings into clear guidance for customers, Engineering, Product, and internal teams. In Professional Services, I led customer implementations, built dashboards, supported user training, documented handoff processes, and helped customers understand not just what was configured, but how the underlying systems behaved.</w:t>
       </w:r>
     </w:p>
     <w:p>
+      <w:pPr>
+        <w:pStyle w:val="NormalWeb"/>
+        <w:rPr>
+          <w:rFonts w:ascii="Calibri" w:hAnsi="Calibri" w:cs="Calibri"/>
+        </w:rPr>
+      </w:pPr>
       <w:r>
-        <w:t xml:space="preserve">What I would bring </w:t>
-      </w:r>
-      <w:proofErr w:type="spellStart"/>
-      <w:r>
-        <w:t>SimplePractice</w:t>
-      </w:r>
-      <w:proofErr w:type="spellEnd"/>
-      <w:r>
-        <w:t xml:space="preserve"> is someone who can handle support requests with patience and clarity, but who can also see patterns, document repeatable fixes, build practical improvements, and reduce recurring friction for employees. I am comfortable learning new SaaS tools quickly, communicating with both technical and non-technical users, and taking ownership of problems until they are actually resolved.</w:t>
+        <w:rPr>
+          <w:rFonts w:ascii="Calibri" w:hAnsi="Calibri" w:cs="Calibri"/>
+        </w:rPr>
+        <w:t>More recently, through Pearl Marketing and freelance work, I have implemented and supported production WordPress and WooCommerce applications for small-business clients. That work has required turning messy operational requirements into structured workflows, conditional logic, forms, subscription behavior, customer notifications, documentation, and repeatable support processes. I also built Subscription Everything, a commercial WooCommerce plugin, using AI-assisted development while maintaining human ownership over architecture, testing, edge cases, and regression validation. That experience maps closely to the systems stewardship Thyme Care describes: building carefully, documenting clearly, maintaining consistency, and improving tools over time rather than allowing short-term fixes to create long-term disorder.</w:t>
       </w:r>
     </w:p>
     <w:p>
+      <w:pPr>
+        <w:pStyle w:val="NormalWeb"/>
+        <w:rPr>
+          <w:rFonts w:ascii="Calibri" w:hAnsi="Calibri" w:cs="Calibri"/>
+        </w:rPr>
+      </w:pPr>
       <w:r>
-        <w:t xml:space="preserve">I would welcome the opportunity to bring that mix of support discipline, automation mindset, documentation strength, and user empathy to </w:t>
+        <w:rPr>
+          <w:rFonts w:ascii="Calibri" w:hAnsi="Calibri" w:cs="Calibri"/>
+        </w:rPr>
+        <w:t xml:space="preserve">I also sincerely </w:t>
       </w:r>
-      <w:proofErr w:type="spellStart"/>
       <w:r>
-        <w:t>SimplePractice</w:t>
+        <w:rPr>
+          <w:rFonts w:ascii="Calibri" w:hAnsi="Calibri" w:cs="Calibri"/>
+        </w:rPr>
+        <w:t>connected</w:t>
       </w:r>
-      <w:proofErr w:type="spellEnd"/>
       <w:r>
-        <w:t>.</w:t>
+        <w:rPr>
+          <w:rFonts w:ascii="Calibri" w:hAnsi="Calibri" w:cs="Calibri"/>
+        </w:rPr>
+        <w:t xml:space="preserve"> with Thyme Care’s statement that “technology should strengthen the human connection at the center of care.” That is how I think about technology broadly</w:t>
+      </w:r>
+      <w:r>
+        <w:rPr>
+          <w:rFonts w:ascii="Calibri" w:hAnsi="Calibri" w:cs="Calibri"/>
+        </w:rPr>
+        <w:t xml:space="preserve"> – it exists to enhance the human experience, not replace it</w:t>
+      </w:r>
+      <w:r>
+        <w:rPr>
+          <w:rFonts w:ascii="Calibri" w:hAnsi="Calibri" w:cs="Calibri"/>
+        </w:rPr>
+        <w:t xml:space="preserve">. Thyme Care’s use of technology, automation, data, and AI to support people through cancer care stands out to me because the work </w:t>
+      </w:r>
+      <w:r>
+        <w:rPr>
+          <w:rFonts w:ascii="Calibri" w:hAnsi="Calibri" w:cs="Calibri"/>
+        </w:rPr>
+        <w:t>is complex, but also deeply human. I genuinely care strongly about cancer treatment. Enabling providers to work quickly and easily with their technological systems frees them up to focus on the critical decision-making needed for effective patient treatment.</w:t>
       </w:r>
     </w:p>
     <w:p>
+      <w:pPr>
+        <w:pStyle w:val="NormalWeb"/>
+        <w:rPr>
+          <w:rFonts w:ascii="Calibri" w:hAnsi="Calibri" w:cs="Calibri"/>
+        </w:rPr>
+      </w:pPr>
       <w:r>
+        <w:rPr>
+          <w:rFonts w:ascii="Calibri" w:hAnsi="Calibri" w:cs="Calibri"/>
+        </w:rPr>
+        <w:t xml:space="preserve">What I would bring to Thyme Care is a practical implementation mindset: </w:t>
+      </w:r>
+      <w:r>
+        <w:rPr>
+          <w:rFonts w:ascii="Calibri" w:hAnsi="Calibri" w:cs="Calibri"/>
+        </w:rPr>
+        <w:t xml:space="preserve">understand the problem, communicate effectively with stakeholders and internal team members, and design a bulletproof solution. </w:t>
+      </w:r>
+      <w:r>
+        <w:rPr>
+          <w:rFonts w:ascii="Calibri" w:hAnsi="Calibri" w:cs="Calibri"/>
+        </w:rPr>
+        <w:t>I would be grateful for the opportunity to bring my support, implementation, and workflow-building experience to Thyme Care’s mission of making cancer care more connected, compassionate, and human.</w:t>
+      </w:r>
+    </w:p>
+    <w:p>
+      <w:pPr>
+        <w:pStyle w:val="NormalWeb"/>
+        <w:rPr>
+          <w:rFonts w:ascii="Calibri" w:hAnsi="Calibri" w:cs="Calibri"/>
+        </w:rPr>
+      </w:pPr>
+      <w:r>
+        <w:rPr>
+          <w:rFonts w:ascii="Calibri" w:hAnsi="Calibri" w:cs="Calibri"/>
+        </w:rPr>
         <w:t>Sincerely,</w:t>
       </w:r>
       <w:r>
+        <w:rPr>
+          <w:rFonts w:ascii="Calibri" w:hAnsi="Calibri" w:cs="Calibri"/>
+        </w:rPr>
         <w:br/>
         <w:t>Caleb Miller</w:t>
       </w:r>
     </w:p>
-    <w:p/>
+    <w:p>
+      <w:pPr>
+        <w:rPr>
+          <w:rFonts w:ascii="Calibri" w:hAnsi="Calibri" w:cs="Calibri"/>
+        </w:rPr>
+      </w:pPr>
+    </w:p>
     <w:sectPr>
       <w:pgSz w:w="12240" w:h="15840"/>
       <w:pgMar w:top="648" w:right="792" w:bottom="648" w:left="792" w:header="720" w:footer="720" w:gutter="0"/>
@@ -1548,6 +1662,7 @@
   <w:style w:type="character" w:default="1" w:styleId="DefaultParagraphFont">
     <w:name w:val="Default Paragraph Font"/>
     <w:uiPriority w:val="1"/>
+    <w:semiHidden/>
     <w:unhideWhenUsed/>
   </w:style>
   <w:style w:type="table" w:default="1" w:styleId="TableNormal">

</xml_diff>